<commit_message>
Perfiles: crear y recuperar perfil tras el login
- Tabla public.profiles con RLS (migración versionada y tests SQL)
- ProfileStore, repositorio Supabase y pantalla de perfil
- Tests de lógica de perfiles con repositorio falso
- Documentación actualizada (README, esquema, plan, requisitos)

Co-Authored-By: Claude Opus 5.5 <noreply@anthropic.com>
</commit_message>
<xml_diff>
--- a/docs/requisitos-album-rater.docx
+++ b/docs/requisitos-album-rater.docx
@@ -457,7 +457,7 @@
                 <w:color w:val="233447"/>
                 <w:rtl w:val="0"/>
               </w:rPr>
-              <w:t xml:space="preserve">Borrador v0.2</w:t>
+              <w:t xml:space="preserve">Borrador v0.3</w:t>
             </w:r>
             <w:r>
               <w:rPr>
@@ -1504,7 +1504,7 @@
                 <w:rFonts w:ascii="Arial" w:hAnsi="Arial"/>
                 <w:sz w:val="20"/>
               </w:rPr>
-              <w:t>Situación: Prioridad actual. Diseño propuesto; no implementado.</w:t>
+              <w:t>Situación: Implementado. Pruebas de lógica Swift superadas; recorrido en iPhone pendiente.</w:t>
             </w:r>
           </w:p>
         </w:tc>
@@ -1586,7 +1586,7 @@
                 <w:rFonts w:ascii="Arial" w:hAnsi="Arial"/>
                 <w:sz w:val="20"/>
               </w:rPr>
-              <w:t>Situación: Prioridad actual. Unicidad solicitada; formato propuesto en la sección 3.</w:t>
+              <w:t>Situación: Implementado. Restricción UNIQUE probada en PostgreSQL; formato inicial de la sección 3.</w:t>
             </w:r>
           </w:p>
         </w:tc>
@@ -2199,7 +2199,7 @@
                 <w:rFonts w:ascii="Arial" w:hAnsi="Arial"/>
                 <w:sz w:val="20"/>
               </w:rPr>
-              <w:t>Situación: Prioridad actual. Pendiente de implementar y probar con RLS.</w:t>
+              <w:t>Situación: Implementado con RLS. Pruebas SQL con dos cuentas y sin sesión; ver registro técnico en supabase/README.md.</w:t>
             </w:r>
           </w:p>
         </w:tc>
@@ -2363,7 +2363,7 @@
                 <w:rFonts w:ascii="Arial" w:hAnsi="Arial"/>
                 <w:sz w:val="20"/>
               </w:rPr>
-              <w:t>Situación: Prioridad actual. Pendiente de implementar.</w:t>
+              <w:t>Situación: Implementado. Restricciones probadas con supabase/tests/profiles.sql.</w:t>
             </w:r>
           </w:p>
         </w:tc>
@@ -2445,7 +2445,7 @@
                 <w:rFonts w:ascii="Arial" w:hAnsi="Arial"/>
                 <w:sz w:val="20"/>
               </w:rPr>
-              <w:t>Situación: Prioridad actual. Propuesta; pendiente de implementar.</w:t>
+              <w:t>Situación: Implementado. Pruebas de errores y reintentos de lógica superadas; corte de red en iPhone pendiente.</w:t>
             </w:r>
           </w:p>
         </w:tc>
@@ -2527,7 +2527,7 @@
                 <w:rFonts w:ascii="Arial" w:hAnsi="Arial"/>
                 <w:sz w:val="20"/>
               </w:rPr>
-              <w:t>Situación: Prioridad actual. Propuesta; aún no hay migraciones.</w:t>
+              <w:t>Situación: Implementado. Migración 20260911000100_create_profiles.sql aplicada y comprobada en PostgreSQL aislado.</w:t>
             </w:r>
           </w:p>
         </w:tc>
@@ -2658,7 +2658,7 @@
           <w:color w:val="233447"/>
           <w:rtl w:val="0"/>
         </w:rPr>
-        <w:t>Diseño propuesto de public.profiles. Todavía no existe una migración que lo cree en Supabase. La cuenta y sus credenciales continúan gestionadas por Supabase Auth.</w:t>
+        <w:t>public.profiles está creada en Supabase mediante la migración 20260911000100_create_profiles.sql. La app permite guardar y leer el perfil. Supabase Auth sigue gestionando las cuentas y credenciales.</w:t>
       </w:r>
     </w:p>
     <w:p>
@@ -2752,7 +2752,7 @@
         <w:rPr>
           <w:rtl w:val="0"/>
         </w:rPr>
-        <w:t>Propuesta de formato del username</w:t>
+        <w:t>Formato inicial del username</w:t>
       </w:r>
     </w:p>
     <w:p>
@@ -2769,7 +2769,7 @@
           <w:color w:val="233447"/>
           <w:rtl w:val="0"/>
         </w:rPr>
-        <w:t>Entre 3 y 30 caracteres: letras a–z, números y guion bajo. Se quitarían espacios de los extremos y se guardaría en minúsculas. Jaime y jaime representarían el mismo username. Esta regla de formato está pendiente de confirmar; la unicidad sí está solicitada.</w:t>
+        <w:t>Entre 3 y 30 caracteres: letras a–z, números y guion bajo. Se quitan espacios de los extremos y se guarda en minúsculas. Jaime y jaime representarían el mismo username. Este es el formato inicial implementado; la base de datos exige unicidad y rechaza formatos inválidos.</w:t>
       </w:r>
     </w:p>
     <w:p>
@@ -2810,7 +2810,7 @@
           <w:color w:val="233447"/>
           <w:rtl w:val="0"/>
         </w:rPr>
-        <w:t>D-001 — Confirmar formato del username y si podrá cambiarse o reutilizarse tras borrar una cuenta.</w:t>
+        <w:t>D-001 — Definir las reglas de la futura edición del username. No hay pantalla de edición ni reserva histórica de nombres; la base permite actualizar los datos propios.</w:t>
       </w:r>
     </w:p>
     <w:p>
@@ -2931,7 +2931,7 @@
           <w:color w:val="233447"/>
           <w:rtl w:val="0"/>
         </w:rPr>
-        <w:t>Historial: v0.1 · 11 septiembre 2026 · Primera versión con cuentas, perfiles, username único y visión de escucha. Revisión de propuestas pendiente. v0.2 · Requisitos reorganizados en tablas editables con columnas ID y Descripción; se conservan los 17 requisitos.</w:t>
+        <w:t>Historial: v0.1 · 11 septiembre 2026 · Primera versión con cuentas, perfiles, username único y visión de escucha. Revisión de propuestas pendiente. v0.2 · Requisitos reorganizados en tablas editables con columnas ID y Descripción; se conservan los 17 requisitos. v0.3 · Creación de profiles, permisos y conexión Swift para guardar y leer el perfil.</w:t>
       </w:r>
     </w:p>
     <w:p>
@@ -3020,7 +3020,7 @@
         <w:vertAlign w:val="baseline"/>
         <w:rtl w:val="0"/>
       </w:rPr>
-      <w:t xml:space="preserve">Album Rater | Requisitos v0.2</w:t>
+      <w:t xml:space="preserve">Album Rater | Requisitos v0.3</w:t>
     </w:r>
     <w:r>
       <w:rPr>

</xml_diff>